<commit_message>
Review v1.1 after Menna's comments; MCP-only filter in both parsers
Review (docs/Review_D_extraction_for_Menna.docx):
- network claims record world = open | closed | unknown, judged by the
  interaction; a service name or fixed host does not make it closed
- aggregation reports `conflicting` instead of choosing affirmed
- two-model vote keeps any agreement, including not_stated
- POST /api/search is read because of the path, not the method

Parsers: the CLIs skip repos where no file imports an MCP library
(--all keeps them); checked per repo since tools are often defined in a
file that does not import the SDK.

Co-Authored-By: Claude Opus 5.5 <noreply@anthropic.com>
</commit_message>
<xml_diff>
--- a/docs/Review_D_extraction_for_Menna.docx
+++ b/docs/Review_D_extraction_for_Menna.docx
@@ -47,6 +47,31 @@
           <w:szCs w:val="21"/>
         </w:rPr>
         <w:t xml:space="preserve"> (Menna Samy, 19 Oct 2026) · prepared with Tasneem, 19 Oct 2026</w:t>
+      </w:r>
+    </w:p>
+    <w:p>
+      <w:pPr>
+        <w:spacing w:after="110" w:line="288"/>
+      </w:pPr>
+      <w:r>
+        <w:rPr>
+          <w:rFonts w:ascii="Calibri" w:cs="Calibri" w:eastAsia="Calibri" w:hAnsi="Calibri"/>
+          <w:b/>
+          <w:bCs/>
+          <w:color w:val="8A3B12"/>
+          <w:sz w:val="21"/>
+          <w:szCs w:val="21"/>
+        </w:rPr>
+        <w:t xml:space="preserve">v1.1 (20 Oct 2026): </w:t>
+      </w:r>
+      <w:r>
+        <w:rPr>
+          <w:rFonts w:ascii="Calibri" w:cs="Calibri" w:eastAsia="Calibri" w:hAnsi="Calibri"/>
+          <w:color w:val="8A3B12"/>
+          <w:sz w:val="21"/>
+          <w:szCs w:val="21"/>
+        </w:rPr>
+        <w:t xml:space="preserve">four corrections from Menna's comments. (1) A service name or fixed host does not make an interaction closed; network now records world = open | closed | unknown. (2) Aggregation reports conflicting instead of choosing affirmed. (3) In the two-model vote, any agreement is kept, including not_stated. (4) The POST /api/search example is read because of the path, not the method.</w:t>
       </w:r>
     </w:p>
     <w:p>
@@ -283,7 +308,7 @@
           <w:sz w:val="21"/>
           <w:szCs w:val="21"/>
         </w:rPr>
-        <w:t xml:space="preserve">Split network by target</w:t>
+        <w:t xml:space="preserve">Record the world of a network claim</w:t>
       </w:r>
       <w:r>
         <w:rPr>
@@ -1456,7 +1481,7 @@
                 <w:sz w:val="18"/>
                 <w:szCs w:val="18"/>
               </w:rPr>
-              <w:t xml:space="preserve">Under description-only input. With server_name in the input it becomes affirmed (named_service): Browserbase is not apibase (rule N2)</w:t>
+              <w:t xml:space="preserve">Under description-only input. With server_name in the input it becomes affirmed (Browserbase is not apibase), world unknown (rule N2)</w:t>
             </w:r>
           </w:p>
         </w:tc>
@@ -2909,7 +2934,7 @@
                 <w:sz w:val="18"/>
                 <w:szCs w:val="18"/>
               </w:rPr>
-              <w:t xml:space="preserve">target</w:t>
+              <w:t xml:space="preserve">world</w:t>
             </w:r>
           </w:p>
         </w:tc>
@@ -2938,7 +2963,7 @@
                 <w:sz w:val="18"/>
                 <w:szCs w:val="18"/>
               </w:rPr>
-              <w:t xml:space="preserve">open | named_service | unspecified (network only)</w:t>
+              <w:t xml:space="preserve">open | closed | unknown (network only), judged by the interaction, not the address</w:t>
             </w:r>
           </w:p>
         </w:tc>
@@ -3112,7 +3137,52 @@
           <w:sz w:val="17"/>
           <w:szCs w:val="17"/>
         </w:rPr>
-        <w:t xml:space="preserve">  affirmed     if any claim on e is affirmed   (any scope)</w:t>
+        <w:t xml:space="preserve">  conflicting  if e is affirmed and denied with the same scope and</w:t>
+      </w:r>
+    </w:p>
+    <w:p>
+      <w:pPr>
+        <w:shd w:fill="F3F3F3" w:color="auto" w:val="clear"/>
+        <w:spacing w:after="0" w:line="252"/>
+        <w:ind w:left="120" w:right="120"/>
+      </w:pPr>
+      <w:r>
+        <w:rPr>
+          <w:rFonts w:ascii="Consolas" w:cs="Consolas" w:eastAsia="Consolas" w:hAnsi="Consolas"/>
+          <w:sz w:val="17"/>
+          <w:szCs w:val="17"/>
+        </w:rPr>
+        <w:t xml:space="preserve">               condition (or affirmed and denied globally)</w:t>
+      </w:r>
+    </w:p>
+    <w:p>
+      <w:pPr>
+        <w:shd w:fill="F3F3F3" w:color="auto" w:val="clear"/>
+        <w:spacing w:after="0" w:line="252"/>
+        <w:ind w:left="120" w:right="120"/>
+      </w:pPr>
+      <w:r>
+        <w:rPr>
+          <w:rFonts w:ascii="Consolas" w:cs="Consolas" w:eastAsia="Consolas" w:hAnsi="Consolas"/>
+          <w:sz w:val="17"/>
+          <w:szCs w:val="17"/>
+        </w:rPr>
+        <w:t xml:space="preserve">               -&gt; needs_review; never resolved silently</w:t>
+      </w:r>
+    </w:p>
+    <w:p>
+      <w:pPr>
+        <w:shd w:fill="F3F3F3" w:color="auto" w:val="clear"/>
+        <w:spacing w:after="0" w:line="252"/>
+        <w:ind w:left="120" w:right="120"/>
+      </w:pPr>
+      <w:r>
+        <w:rPr>
+          <w:rFonts w:ascii="Consolas" w:cs="Consolas" w:eastAsia="Consolas" w:hAnsi="Consolas"/>
+          <w:sz w:val="17"/>
+          <w:szCs w:val="17"/>
+        </w:rPr>
+        <w:t xml:space="preserve">  affirmed     elif any claim on e is affirmed   (any scope)</w:t>
       </w:r>
     </w:p>
     <w:p>
@@ -3528,7 +3598,7 @@
           <w:sz w:val="17"/>
           <w:szCs w:val="17"/>
         </w:rPr>
-        <w:t xml:space="preserve">   "actor": "tool", "target": "named_service", "condition": null,</w:t>
+        <w:t xml:space="preserve">   "actor": "tool", "world": "unknown", "condition": null,</w:t>
       </w:r>
     </w:p>
     <w:p>
@@ -4468,7 +4538,7 @@
                 <w:sz w:val="18"/>
                 <w:szCs w:val="18"/>
               </w:rPr>
-              <w:t xml:space="preserve">network affirmed, target=open</w:t>
+              <w:t xml:space="preserve">network affirmed, world=open</w:t>
             </w:r>
           </w:p>
         </w:tc>
@@ -4586,7 +4656,7 @@
                 <w:sz w:val="18"/>
                 <w:szCs w:val="18"/>
               </w:rPr>
-              <w:t xml:space="preserve">if the service is clearly not the server's own: affirmed, named_service; if it may be the server's own backend: uncertain</w:t>
+              <w:t xml:space="preserve">network: affirmed if the service is clearly not the server's own, uncertain if it may be the server's own backend. world: from what the tool does there (search arbitrary entities = open; the user's own bounded data = closed); the name alone = unknown</w:t>
             </w:r>
           </w:p>
         </w:tc>
@@ -4882,7 +4952,7 @@
         </w:rPr>
         <w:t xml:space="preserve">Source: </w:t>
       </w:r>
-      <w:hyperlink w:history="1" r:id="rIdvwuk2m7hcdtwrsmnpuvoe">
+      <w:hyperlink w:history="1" r:id="rIdktylgg7hsbjsmmilczbwx">
         <w:r>
           <w:rPr>
             <w:rStyle w:val="Hyperlink"/>
@@ -4900,7 +4970,7 @@
         </w:rPr>
         <w:t xml:space="preserve"> and </w:t>
       </w:r>
-      <w:hyperlink w:history="1" r:id="rId5-w0tddqbwg7jkjyts0z6">
+      <w:hyperlink w:history="1" r:id="rIdmzfwpp364stgwohlj0p-a">
         <w:r>
           <w:rPr>
             <w:rStyle w:val="Hyperlink"/>
@@ -5554,7 +5624,7 @@
                 <w:sz w:val="18"/>
                 <w:szCs w:val="18"/>
               </w:rPr>
-              <w:t xml:space="preserve">network with target=open</w:t>
+              <w:t xml:space="preserve">network with world=open</w:t>
             </w:r>
           </w:p>
         </w:tc>
@@ -5612,7 +5682,7 @@
                 <w:sz w:val="18"/>
                 <w:szCs w:val="18"/>
               </w:rPr>
-              <w:t xml:space="preserve">was: any network. named_service → review</w:t>
+              <w:t xml:space="preserve">was: any network. world=unknown → review</w:t>
             </w:r>
           </w:p>
         </w:tc>
@@ -5879,7 +5949,7 @@
           <w:sz w:val="21"/>
           <w:szCs w:val="21"/>
         </w:rPr>
-        <w:t xml:space="preserve">First, a description that denies writes on a tool annotated readOnlyHint=false is not an inconsistency: the annotation is just less informative. Report it separately as “annotation weaker than description”. Second, the network/openWorld split applies to Tasneem's detector too: a request to a URL taken from tool arguments is open; a request to a literal host is a named service. We will change both sides together.</w:t>
+        <w:t xml:space="preserve">First, a description that denies writes on a tool annotated readOnlyHint=false is not an inconsistency: the annotation is just less informative. Report it separately as “annotation weaker than description”. Second, the network/openWorld split applies to Tasneem's detector too: a request to a URL taken from tool arguments is open; a request to a literal host is unknown and goes to review, since one host can expose an open world. We will change both sides together.</w:t>
       </w:r>
     </w:p>
     <w:p>
@@ -6791,7 +6861,7 @@
           <w:sz w:val="21"/>
           <w:szCs w:val="21"/>
         </w:rPr>
-        <w:t xml:space="preserve">With two votes: both affirm → affirmed; both deny → denied; anything else → uncertain + needs_review. For the inconsistency count, report the strict version (both must agree) and the union, so the reader sees the range.</w:t>
+        <w:t xml:space="preserve">With two votes: any agreement is kept as it is (both affirmed, both denied, both uncertain, or both not_stated); a disagreement → uncertain + needs_review. For the inconsistency count, report the strict version (both must agree) and the union, so the reader sees the range.</w:t>
       </w:r>
     </w:p>
     <w:p>
@@ -7149,7 +7219,7 @@
           <w:sz w:val="17"/>
           <w:szCs w:val="17"/>
         </w:rPr>
-        <w:t xml:space="preserve">    target = "open" (a URL/address the caller supplies, the web,</w:t>
+        <w:t xml:space="preserve">    world = "open" (the tool can reach entities the server does not</w:t>
       </w:r>
     </w:p>
     <w:p>
@@ -7164,7 +7234,7 @@
           <w:sz w:val="17"/>
           <w:szCs w:val="17"/>
         </w:rPr>
-        <w:t xml:space="preserve">    arbitrary third parties, messages to people) | "named_service"</w:t>
+        <w:t xml:space="preserve">    control: a URL/address the caller supplies, web search, arbitrary</w:t>
       </w:r>
     </w:p>
     <w:p>
@@ -7179,7 +7249,7 @@
           <w:sz w:val="17"/>
           <w:szCs w:val="17"/>
         </w:rPr>
-        <w:t xml:space="preserve">    (one specific named external service) | "unspecified".</w:t>
+        <w:t xml:space="preserve">    third parties, messages to people) | "closed" (a bounded set the</w:t>
       </w:r>
     </w:p>
     <w:p>
@@ -7194,7 +7264,7 @@
           <w:sz w:val="17"/>
           <w:szCs w:val="17"/>
         </w:rPr>
-        <w:t xml:space="preserve"> </w:t>
+        <w:t xml:space="preserve">    description names, e.g. the user's own notes) | "unknown".</w:t>
       </w:r>
     </w:p>
     <w:p>
@@ -7209,7 +7279,7 @@
           <w:sz w:val="17"/>
           <w:szCs w:val="17"/>
         </w:rPr>
-        <w:t xml:space="preserve">For every claim the description makes about an effect, output a record:</w:t>
+        <w:t xml:space="preserve">    A service name or a fixed host does NOT make it closed: one service</w:t>
       </w:r>
     </w:p>
     <w:p>
@@ -7224,7 +7294,7 @@
           <w:sz w:val="17"/>
           <w:szCs w:val="17"/>
         </w:rPr>
-        <w:t xml:space="preserve">  effect, polarity (affirmed | denied | uncertain), scope ("global" or the</w:t>
+        <w:t xml:space="preserve">    can search an open world. Judge the interaction, not the address.</w:t>
       </w:r>
     </w:p>
     <w:p>
@@ -7239,7 +7309,7 @@
           <w:sz w:val="17"/>
           <w:szCs w:val="17"/>
         </w:rPr>
-        <w:t xml:space="preserve">  resource it is limited to, e.g. "filesystem", "javascript"), actor</w:t>
+        <w:t xml:space="preserve"> </w:t>
       </w:r>
     </w:p>
     <w:p>
@@ -7254,7 +7324,7 @@
           <w:sz w:val="17"/>
           <w:szCs w:val="17"/>
         </w:rPr>
-        <w:t xml:space="preserve">  (tool | provider | other_tool | user), condition (null or the condition</w:t>
+        <w:t xml:space="preserve">For every claim the description makes about an effect, output a record:</w:t>
       </w:r>
     </w:p>
     <w:p>
@@ -7269,7 +7339,7 @@
           <w:sz w:val="17"/>
           <w:szCs w:val="17"/>
         </w:rPr>
-        <w:t xml:space="preserve">  text), evidence (an exact substring of the description), and mode or</w:t>
+        <w:t xml:space="preserve">  effect, polarity (affirmed | denied | uncertain), scope ("global" or the</w:t>
       </w:r>
     </w:p>
     <w:p>
@@ -7284,7 +7354,7 @@
           <w:sz w:val="17"/>
           <w:szCs w:val="17"/>
         </w:rPr>
-        <w:t xml:space="preserve">  target where they apply.</w:t>
+        <w:t xml:space="preserve">  resource it is limited to, e.g. "filesystem", "javascript"), actor</w:t>
       </w:r>
     </w:p>
     <w:p>
@@ -7299,7 +7369,7 @@
           <w:sz w:val="17"/>
           <w:szCs w:val="17"/>
         </w:rPr>
-        <w:t xml:space="preserve"> </w:t>
+        <w:t xml:space="preserve">  (tool | provider | other_tool | user), condition (null or the condition</w:t>
       </w:r>
     </w:p>
     <w:p>
@@ -7314,7 +7384,7 @@
           <w:sz w:val="17"/>
           <w:szCs w:val="17"/>
         </w:rPr>
-        <w:t xml:space="preserve">Rules</w:t>
+        <w:t xml:space="preserve">  text), evidence (an exact substring of the description), and mode or</w:t>
       </w:r>
     </w:p>
     <w:p>
@@ -7329,7 +7399,7 @@
           <w:sz w:val="17"/>
           <w:szCs w:val="17"/>
         </w:rPr>
-        <w:t xml:space="preserve">1. Only this tool's own action has actor = tool. Advice to call another</w:t>
+        <w:t xml:space="preserve">  world where they apply.</w:t>
       </w:r>
     </w:p>
     <w:p>
@@ -7344,7 +7414,7 @@
           <w:sz w:val="17"/>
           <w:szCs w:val="17"/>
         </w:rPr>
-        <w:t xml:space="preserve">   tool -&gt; other_tool. What a provider does by itself (expiry, cleanup)</w:t>
+        <w:t xml:space="preserve"> </w:t>
       </w:r>
     </w:p>
     <w:p>
@@ -7359,7 +7429,7 @@
           <w:sz w:val="17"/>
           <w:szCs w:val="17"/>
         </w:rPr>
-        <w:t xml:space="preserve">   -&gt; provider.</w:t>
+        <w:t xml:space="preserve">Rules</w:t>
       </w:r>
     </w:p>
     <w:p>
@@ -7374,7 +7444,7 @@
           <w:sz w:val="17"/>
           <w:szCs w:val="17"/>
         </w:rPr>
-        <w:t xml:space="preserve">2. A broad statement ("read-only", "no state changes", "no side effects",</w:t>
+        <w:t xml:space="preserve">1. Only this tool's own action has actor = tool. Advice to call another</w:t>
       </w:r>
     </w:p>
     <w:p>
@@ -7389,7 +7459,7 @@
           <w:sz w:val="17"/>
           <w:szCs w:val="17"/>
         </w:rPr>
-        <w:t xml:space="preserve">   "does not modify anything") = denied write AND denied delete, scope</w:t>
+        <w:t xml:space="preserve">   tool -&gt; other_tool. What a provider does by itself (expiry, cleanup)</w:t>
       </w:r>
     </w:p>
     <w:p>
@@ -7404,7 +7474,7 @@
           <w:sz w:val="17"/>
           <w:szCs w:val="17"/>
         </w:rPr>
-        <w:t xml:space="preserve">   global. It says nothing about execute or network.</w:t>
+        <w:t xml:space="preserve">   -&gt; provider.</w:t>
       </w:r>
     </w:p>
     <w:p>
@@ -7419,7 +7489,7 @@
           <w:sz w:val="17"/>
           <w:szCs w:val="17"/>
         </w:rPr>
-        <w:t xml:space="preserve">3. A limited statement ("no filesystem access", "does not execute</w:t>
+        <w:t xml:space="preserve">2. A broad statement ("read-only", "no state changes", "no side effects",</w:t>
       </w:r>
     </w:p>
     <w:p>
@@ -7434,7 +7504,7 @@
           <w:sz w:val="17"/>
           <w:szCs w:val="17"/>
         </w:rPr>
-        <w:t xml:space="preserve">   JavaScript") is a denial with that scope only. Never widen it.</w:t>
+        <w:t xml:space="preserve">   "does not modify anything") = denied write AND denied delete, scope</w:t>
       </w:r>
     </w:p>
     <w:p>
@@ -7449,7 +7519,7 @@
           <w:sz w:val="17"/>
           <w:szCs w:val="17"/>
         </w:rPr>
-        <w:t xml:space="preserve">4. uncertain needs a quote that bears on the effect but leaves it open</w:t>
+        <w:t xml:space="preserve">   global. It says nothing about execute or network.</w:t>
       </w:r>
     </w:p>
     <w:p>
@@ -7464,7 +7534,7 @@
           <w:sz w:val="17"/>
           <w:szCs w:val="17"/>
         </w:rPr>
-        <w:t xml:space="preserve">   ("sync", "manage", "live data", a named service that may be the</w:t>
+        <w:t xml:space="preserve">3. A limited statement ("no filesystem access", "does not execute</w:t>
       </w:r>
     </w:p>
     <w:p>
@@ -7479,7 +7549,7 @@
           <w:sz w:val="17"/>
           <w:szCs w:val="17"/>
         </w:rPr>
-        <w:t xml:space="preserve">   server's own backend). If no text bears on an effect, output no record.</w:t>
+        <w:t xml:space="preserve">   JavaScript") is a denial with that scope only. Never widen it.</w:t>
       </w:r>
     </w:p>
     <w:p>
@@ -7494,7 +7564,7 @@
           <w:sz w:val="17"/>
           <w:szCs w:val="17"/>
         </w:rPr>
-        <w:t xml:space="preserve">5. An HTTP method alone (POST, GET) does not establish write or read.</w:t>
+        <w:t xml:space="preserve">4. uncertain needs a quote that bears on the effect but leaves it open</w:t>
       </w:r>
     </w:p>
     <w:p>
@@ -7509,7 +7579,52 @@
           <w:sz w:val="17"/>
           <w:szCs w:val="17"/>
         </w:rPr>
-        <w:t xml:space="preserve">   Judge the action described.</w:t>
+        <w:t xml:space="preserve">   ("sync", "manage", "live data", a named service that may be the</w:t>
+      </w:r>
+    </w:p>
+    <w:p>
+      <w:pPr>
+        <w:shd w:fill="F3F3F3" w:color="auto" w:val="clear"/>
+        <w:spacing w:after="0" w:line="252"/>
+        <w:ind w:left="120" w:right="120"/>
+      </w:pPr>
+      <w:r>
+        <w:rPr>
+          <w:rFonts w:ascii="Consolas" w:cs="Consolas" w:eastAsia="Consolas" w:hAnsi="Consolas"/>
+          <w:sz w:val="17"/>
+          <w:szCs w:val="17"/>
+        </w:rPr>
+        <w:t xml:space="preserve">   server's own backend). If no text bears on an effect, output no record.</w:t>
+      </w:r>
+    </w:p>
+    <w:p>
+      <w:pPr>
+        <w:shd w:fill="F3F3F3" w:color="auto" w:val="clear"/>
+        <w:spacing w:after="0" w:line="252"/>
+        <w:ind w:left="120" w:right="120"/>
+      </w:pPr>
+      <w:r>
+        <w:rPr>
+          <w:rFonts w:ascii="Consolas" w:cs="Consolas" w:eastAsia="Consolas" w:hAnsi="Consolas"/>
+          <w:sz w:val="17"/>
+          <w:szCs w:val="17"/>
+        </w:rPr>
+        <w:t xml:space="preserve">5. An HTTP method alone (POST, GET) does not establish write or read.</w:t>
+      </w:r>
+    </w:p>
+    <w:p>
+      <w:pPr>
+        <w:shd w:fill="F3F3F3" w:color="auto" w:val="clear"/>
+        <w:spacing w:after="0" w:line="252"/>
+        <w:ind w:left="120" w:right="120"/>
+      </w:pPr>
+      <w:r>
+        <w:rPr>
+          <w:rFonts w:ascii="Consolas" w:cs="Consolas" w:eastAsia="Consolas" w:hAnsi="Consolas"/>
+          <w:sz w:val="17"/>
+          <w:szCs w:val="17"/>
+        </w:rPr>
+        <w:t xml:space="preserve">   Judge the action described; a path such as /search may show it.</w:t>
       </w:r>
     </w:p>
     <w:p>
@@ -8690,7 +8805,7 @@
                 <w:sz w:val="18"/>
                 <w:szCs w:val="18"/>
               </w:rPr>
-              <w:t xml:space="preserve">read (H1)</w:t>
+              <w:t xml:space="preserve">read, from the path “search”; POST alone says nothing (H1)</w:t>
             </w:r>
           </w:p>
         </w:tc>

</xml_diff>